<commit_message>
Refresh project documentation and roadmap
</commit_message>
<xml_diff>
--- a/docs/Futsi_Documentacion_Codigo.docx
+++ b/docs/Futsi_Documentacion_Codigo.docx
@@ -3,14 +3,27 @@
 <w:document xmlns:wpc="http://schemas.microsoft.com/office/word/2010/wordprocessingCanvas" xmlns:mo="http://schemas.microsoft.com/office/mac/office/2008/main" xmlns:mc="http://schemas.openxmlformats.org/markup-compatibility/2006" xmlns:mv="urn:schemas-microsoft-com:mac:vml" xmlns:o="urn:schemas-microsoft-com:office:office" xmlns:r="http://schemas.openxmlformats.org/officeDocument/2006/relationships" xmlns:m="http://schemas.openxmlformats.org/officeDocument/2006/math" xmlns:v="urn:schemas-microsoft-com:vml" xmlns:wp14="http://schemas.microsoft.com/office/word/2010/wordprocessingDrawing" xmlns:wp="http://schemas.openxmlformats.org/drawingml/2006/wordprocessingDrawing" xmlns:w10="urn:schemas-microsoft-com:office:word" xmlns:w="http://schemas.openxmlformats.org/wordprocessingml/2006/main" xmlns:w14="http://schemas.microsoft.com/office/word/2010/wordml" xmlns:wpg="http://schemas.microsoft.com/office/word/2010/wordprocessingGroup" xmlns:wpi="http://schemas.microsoft.com/office/word/2010/wordprocessingInk" xmlns:wne="http://schemas.microsoft.com/office/word/2006/wordml" xmlns:wps="http://schemas.microsoft.com/office/word/2010/wordprocessingShape" mc:Ignorable="w14 wp14">
   <w:body>
     <w:p>
+      <w:pPr>
+        <w:jc w:val="left"/>
+      </w:pPr>
       <w:r>
         <w:rPr>
           <w:rFonts w:ascii="Arial" w:hAnsi="Arial"/>
           <w:b/>
           <w:color w:val="0F172A"/>
-          <w:sz w:val="44"/>
+          <w:sz w:val="42"/>
         </w:rPr>
-        <w:t>Documentacion tecnica del codigo</w:t>
+        <w:t>Documentacion Tecnica del Codigo - Sprint 2</w:t>
+      </w:r>
+    </w:p>
+    <w:p>
+      <w:r>
+        <w:rPr>
+          <w:rFonts w:ascii="Arial" w:hAnsi="Arial"/>
+          <w:color w:val="52525B"/>
+          <w:sz w:val="16"/>
+        </w:rPr>
+        <w:t>Futsi Mini ERP | Actualizado 2026-05-28</w:t>
       </w:r>
     </w:p>
     <w:p>
@@ -18,12 +31,36 @@
         <w:pStyle w:val="Heading1"/>
       </w:pPr>
       <w:r>
-        <w:t>Resumen</w:t>
+        <w:t>1. Arquitectura</w:t>
       </w:r>
     </w:p>
     <w:p>
       <w:r>
-        <w:t>Backend Django/DRF en back/ y frontend React/Vite/Tailwind en front/. API REST con Token Authentication y portales por rol.</w:t>
+        <w:t>El repositorio esta dividido en back/ para Django REST Framework y front/ para React, Vite y Tailwind. La base local puede correr SQLite; produccion queda preparada para Supabase Postgres. El frontend se publica como estatico y consume el API por VITE_API_URL.</w:t>
+      </w:r>
+    </w:p>
+    <w:p>
+      <w:pPr>
+        <w:pStyle w:val="ListBullet"/>
+      </w:pPr>
+      <w:r>
+        <w:t>Backend: Django, DRF, modelos core, serializers, viewsets, endpoints de reportes, facturas y reconocimiento facial.</w:t>
+      </w:r>
+    </w:p>
+    <w:p>
+      <w:pPr>
+        <w:pStyle w:val="ListBullet"/>
+      </w:pPr>
+      <w:r>
+        <w:t>Frontend: React en un solo entry principal, estilos Tailwind/CSS, roles, dashboards y flujos de caja/familia/coach/contador.</w:t>
+      </w:r>
+    </w:p>
+    <w:p>
+      <w:pPr>
+        <w:pStyle w:val="ListBullet"/>
+      </w:pPr>
+      <w:r>
+        <w:t>Documentos: generados desde tools/build_sprint2_updated_documents.py para mantener consistencia.</w:t>
       </w:r>
     </w:p>
     <w:p>
@@ -31,7 +68,832 @@
         <w:pStyle w:val="Heading1"/>
       </w:pPr>
       <w:r>
-        <w:t>Estructura</w:t>
+        <w:t>2. Endpoints agregados o reforzados en Sprint 2</w:t>
+      </w:r>
+    </w:p>
+    <w:tbl>
+      <w:tblPr>
+        <w:tblStyle w:val="TableGrid"/>
+        <w:tblW w:type="auto" w:w="0"/>
+        <w:tblLook w:firstColumn="1" w:firstRow="1" w:lastColumn="0" w:lastRow="0" w:noHBand="0" w:noVBand="1" w:val="04A0"/>
+      </w:tblPr>
+      <w:tblGrid>
+        <w:gridCol w:w="3264"/>
+        <w:gridCol w:w="3264"/>
+        <w:gridCol w:w="3264"/>
+      </w:tblGrid>
+      <w:tr>
+        <w:tc>
+          <w:tcPr>
+            <w:tcW w:type="dxa" w:w="3264"/>
+          </w:tcPr>
+          <w:p>
+            <w:r>
+              <w:rPr>
+                <w:rFonts w:ascii="Arial" w:hAnsi="Arial"/>
+                <w:sz w:val="16"/>
+              </w:rPr>
+              <w:t>Endpoint</w:t>
+            </w:r>
+          </w:p>
+        </w:tc>
+        <w:tc>
+          <w:tcPr>
+            <w:tcW w:type="dxa" w:w="3264"/>
+          </w:tcPr>
+          <w:p>
+            <w:r>
+              <w:rPr>
+                <w:rFonts w:ascii="Arial" w:hAnsi="Arial"/>
+                <w:sz w:val="16"/>
+              </w:rPr>
+              <w:t>Metodo</w:t>
+            </w:r>
+          </w:p>
+        </w:tc>
+        <w:tc>
+          <w:tcPr>
+            <w:tcW w:type="dxa" w:w="3264"/>
+          </w:tcPr>
+          <w:p>
+            <w:r>
+              <w:rPr>
+                <w:rFonts w:ascii="Arial" w:hAnsi="Arial"/>
+                <w:sz w:val="16"/>
+              </w:rPr>
+              <w:t>Uso</w:t>
+            </w:r>
+          </w:p>
+        </w:tc>
+      </w:tr>
+      <w:tr>
+        <w:tc>
+          <w:tcPr>
+            <w:tcW w:type="dxa" w:w="3264"/>
+          </w:tcPr>
+          <w:p>
+            <w:r>
+              <w:rPr>
+                <w:rFonts w:ascii="Arial" w:hAnsi="Arial"/>
+                <w:sz w:val="16"/>
+              </w:rPr>
+              <w:t>/api/reports/accounting.xlsx</w:t>
+            </w:r>
+          </w:p>
+        </w:tc>
+        <w:tc>
+          <w:tcPr>
+            <w:tcW w:type="dxa" w:w="3264"/>
+          </w:tcPr>
+          <w:p>
+            <w:r>
+              <w:rPr>
+                <w:rFonts w:ascii="Arial" w:hAnsi="Arial"/>
+                <w:sz w:val="16"/>
+              </w:rPr>
+              <w:t>GET</w:t>
+            </w:r>
+          </w:p>
+        </w:tc>
+        <w:tc>
+          <w:tcPr>
+            <w:tcW w:type="dxa" w:w="3264"/>
+          </w:tcPr>
+          <w:p>
+            <w:r>
+              <w:rPr>
+                <w:rFonts w:ascii="Arial" w:hAnsi="Arial"/>
+                <w:sz w:val="16"/>
+              </w:rPr>
+              <w:t>Descarga Excel contable valido para admin/owner/accounting.</w:t>
+            </w:r>
+          </w:p>
+        </w:tc>
+      </w:tr>
+      <w:tr>
+        <w:tc>
+          <w:tcPr>
+            <w:tcW w:type="dxa" w:w="3264"/>
+          </w:tcPr>
+          <w:p>
+            <w:r>
+              <w:rPr>
+                <w:rFonts w:ascii="Arial" w:hAnsi="Arial"/>
+                <w:sz w:val="16"/>
+              </w:rPr>
+              <w:t>/api/invoices/</w:t>
+            </w:r>
+          </w:p>
+        </w:tc>
+        <w:tc>
+          <w:tcPr>
+            <w:tcW w:type="dxa" w:w="3264"/>
+          </w:tcPr>
+          <w:p>
+            <w:r>
+              <w:rPr>
+                <w:rFonts w:ascii="Arial" w:hAnsi="Arial"/>
+                <w:sz w:val="16"/>
+              </w:rPr>
+              <w:t>GET</w:t>
+            </w:r>
+          </w:p>
+        </w:tc>
+        <w:tc>
+          <w:tcPr>
+            <w:tcW w:type="dxa" w:w="3264"/>
+          </w:tcPr>
+          <w:p>
+            <w:r>
+              <w:rPr>
+                <w:rFonts w:ascii="Arial" w:hAnsi="Arial"/>
+                <w:sz w:val="16"/>
+              </w:rPr>
+              <w:t>Lista facturas segun rol.</w:t>
+            </w:r>
+          </w:p>
+        </w:tc>
+      </w:tr>
+      <w:tr>
+        <w:tc>
+          <w:tcPr>
+            <w:tcW w:type="dxa" w:w="3264"/>
+          </w:tcPr>
+          <w:p>
+            <w:r>
+              <w:rPr>
+                <w:rFonts w:ascii="Arial" w:hAnsi="Arial"/>
+                <w:sz w:val="16"/>
+              </w:rPr>
+              <w:t>/api/invoices/simulate/</w:t>
+            </w:r>
+          </w:p>
+        </w:tc>
+        <w:tc>
+          <w:tcPr>
+            <w:tcW w:type="dxa" w:w="3264"/>
+          </w:tcPr>
+          <w:p>
+            <w:r>
+              <w:rPr>
+                <w:rFonts w:ascii="Arial" w:hAnsi="Arial"/>
+                <w:sz w:val="16"/>
+              </w:rPr>
+              <w:t>POST</w:t>
+            </w:r>
+          </w:p>
+        </w:tc>
+        <w:tc>
+          <w:tcPr>
+            <w:tcW w:type="dxa" w:w="3264"/>
+          </w:tcPr>
+          <w:p>
+            <w:r>
+              <w:rPr>
+                <w:rFonts w:ascii="Arial" w:hAnsi="Arial"/>
+                <w:sz w:val="16"/>
+              </w:rPr>
+              <w:t>Genera factura simulada de cargo o gasto.</w:t>
+            </w:r>
+          </w:p>
+        </w:tc>
+      </w:tr>
+      <w:tr>
+        <w:tc>
+          <w:tcPr>
+            <w:tcW w:type="dxa" w:w="3264"/>
+          </w:tcPr>
+          <w:p>
+            <w:r>
+              <w:rPr>
+                <w:rFonts w:ascii="Arial" w:hAnsi="Arial"/>
+                <w:sz w:val="16"/>
+              </w:rPr>
+              <w:t>/api/invoices/{id}/pdf/</w:t>
+            </w:r>
+          </w:p>
+        </w:tc>
+        <w:tc>
+          <w:tcPr>
+            <w:tcW w:type="dxa" w:w="3264"/>
+          </w:tcPr>
+          <w:p>
+            <w:r>
+              <w:rPr>
+                <w:rFonts w:ascii="Arial" w:hAnsi="Arial"/>
+                <w:sz w:val="16"/>
+              </w:rPr>
+              <w:t>GET</w:t>
+            </w:r>
+          </w:p>
+        </w:tc>
+        <w:tc>
+          <w:tcPr>
+            <w:tcW w:type="dxa" w:w="3264"/>
+          </w:tcPr>
+          <w:p>
+            <w:r>
+              <w:rPr>
+                <w:rFonts w:ascii="Arial" w:hAnsi="Arial"/>
+                <w:sz w:val="16"/>
+              </w:rPr>
+              <w:t>Descarga PDF simulado.</w:t>
+            </w:r>
+          </w:p>
+        </w:tc>
+      </w:tr>
+      <w:tr>
+        <w:tc>
+          <w:tcPr>
+            <w:tcW w:type="dxa" w:w="3264"/>
+          </w:tcPr>
+          <w:p>
+            <w:r>
+              <w:rPr>
+                <w:rFonts w:ascii="Arial" w:hAnsi="Arial"/>
+                <w:sz w:val="16"/>
+              </w:rPr>
+              <w:t>/api/invoices/{id}/xml/</w:t>
+            </w:r>
+          </w:p>
+        </w:tc>
+        <w:tc>
+          <w:tcPr>
+            <w:tcW w:type="dxa" w:w="3264"/>
+          </w:tcPr>
+          <w:p>
+            <w:r>
+              <w:rPr>
+                <w:rFonts w:ascii="Arial" w:hAnsi="Arial"/>
+                <w:sz w:val="16"/>
+              </w:rPr>
+              <w:t>GET</w:t>
+            </w:r>
+          </w:p>
+        </w:tc>
+        <w:tc>
+          <w:tcPr>
+            <w:tcW w:type="dxa" w:w="3264"/>
+          </w:tcPr>
+          <w:p>
+            <w:r>
+              <w:rPr>
+                <w:rFonts w:ascii="Arial" w:hAnsi="Arial"/>
+                <w:sz w:val="16"/>
+              </w:rPr>
+              <w:t>Descarga XML simulado.</w:t>
+            </w:r>
+          </w:p>
+        </w:tc>
+      </w:tr>
+      <w:tr>
+        <w:tc>
+          <w:tcPr>
+            <w:tcW w:type="dxa" w:w="3264"/>
+          </w:tcPr>
+          <w:p>
+            <w:r>
+              <w:rPr>
+                <w:rFonts w:ascii="Arial" w:hAnsi="Arial"/>
+                <w:sz w:val="16"/>
+              </w:rPr>
+              <w:t>/api/face-attendance/recognize/</w:t>
+            </w:r>
+          </w:p>
+        </w:tc>
+        <w:tc>
+          <w:tcPr>
+            <w:tcW w:type="dxa" w:w="3264"/>
+          </w:tcPr>
+          <w:p>
+            <w:r>
+              <w:rPr>
+                <w:rFonts w:ascii="Arial" w:hAnsi="Arial"/>
+                <w:sz w:val="16"/>
+              </w:rPr>
+              <w:t>GET</w:t>
+            </w:r>
+          </w:p>
+        </w:tc>
+        <w:tc>
+          <w:tcPr>
+            <w:tcW w:type="dxa" w:w="3264"/>
+          </w:tcPr>
+          <w:p>
+            <w:r>
+              <w:rPr>
+                <w:rFonts w:ascii="Arial" w:hAnsi="Arial"/>
+                <w:sz w:val="16"/>
+              </w:rPr>
+              <w:t>Diagnostico de motor DeepFace/mock.</w:t>
+            </w:r>
+          </w:p>
+        </w:tc>
+      </w:tr>
+      <w:tr>
+        <w:tc>
+          <w:tcPr>
+            <w:tcW w:type="dxa" w:w="3264"/>
+          </w:tcPr>
+          <w:p>
+            <w:r>
+              <w:rPr>
+                <w:rFonts w:ascii="Arial" w:hAnsi="Arial"/>
+                <w:sz w:val="16"/>
+              </w:rPr>
+              <w:t>/api/face-attendance/recognize/</w:t>
+            </w:r>
+          </w:p>
+        </w:tc>
+        <w:tc>
+          <w:tcPr>
+            <w:tcW w:type="dxa" w:w="3264"/>
+          </w:tcPr>
+          <w:p>
+            <w:r>
+              <w:rPr>
+                <w:rFonts w:ascii="Arial" w:hAnsi="Arial"/>
+                <w:sz w:val="16"/>
+              </w:rPr>
+              <w:t>POST</w:t>
+            </w:r>
+          </w:p>
+        </w:tc>
+        <w:tc>
+          <w:tcPr>
+            <w:tcW w:type="dxa" w:w="3264"/>
+          </w:tcPr>
+          <w:p>
+            <w:r>
+              <w:rPr>
+                <w:rFonts w:ascii="Arial" w:hAnsi="Arial"/>
+                <w:sz w:val="16"/>
+              </w:rPr>
+              <w:t>Compara foto capturada contra roster y registra asistencia.</w:t>
+            </w:r>
+          </w:p>
+        </w:tc>
+      </w:tr>
+      <w:tr>
+        <w:tc>
+          <w:tcPr>
+            <w:tcW w:type="dxa" w:w="3264"/>
+          </w:tcPr>
+          <w:p>
+            <w:r>
+              <w:rPr>
+                <w:rFonts w:ascii="Arial" w:hAnsi="Arial"/>
+                <w:sz w:val="16"/>
+              </w:rPr>
+              <w:t>/api/historical-imports/</w:t>
+            </w:r>
+          </w:p>
+        </w:tc>
+        <w:tc>
+          <w:tcPr>
+            <w:tcW w:type="dxa" w:w="3264"/>
+          </w:tcPr>
+          <w:p>
+            <w:r>
+              <w:rPr>
+                <w:rFonts w:ascii="Arial" w:hAnsi="Arial"/>
+                <w:sz w:val="16"/>
+              </w:rPr>
+              <w:t>GET</w:t>
+            </w:r>
+          </w:p>
+        </w:tc>
+        <w:tc>
+          <w:tcPr>
+            <w:tcW w:type="dxa" w:w="3264"/>
+          </w:tcPr>
+          <w:p>
+            <w:r>
+              <w:rPr>
+                <w:rFonts w:ascii="Arial" w:hAnsi="Arial"/>
+                <w:sz w:val="16"/>
+              </w:rPr>
+              <w:t>Lista cargas historicas para admin/contador.</w:t>
+            </w:r>
+          </w:p>
+        </w:tc>
+      </w:tr>
+      <w:tr>
+        <w:tc>
+          <w:tcPr>
+            <w:tcW w:type="dxa" w:w="3264"/>
+          </w:tcPr>
+          <w:p>
+            <w:r>
+              <w:rPr>
+                <w:rFonts w:ascii="Arial" w:hAnsi="Arial"/>
+                <w:sz w:val="16"/>
+              </w:rPr>
+              <w:t>/api/historical-imports/preview/</w:t>
+            </w:r>
+          </w:p>
+        </w:tc>
+        <w:tc>
+          <w:tcPr>
+            <w:tcW w:type="dxa" w:w="3264"/>
+          </w:tcPr>
+          <w:p>
+            <w:r>
+              <w:rPr>
+                <w:rFonts w:ascii="Arial" w:hAnsi="Arial"/>
+                <w:sz w:val="16"/>
+              </w:rPr>
+              <w:t>POST</w:t>
+            </w:r>
+          </w:p>
+        </w:tc>
+        <w:tc>
+          <w:tcPr>
+            <w:tcW w:type="dxa" w:w="3264"/>
+          </w:tcPr>
+          <w:p>
+            <w:r>
+              <w:rPr>
+                <w:rFonts w:ascii="Arial" w:hAnsi="Arial"/>
+                <w:sz w:val="16"/>
+              </w:rPr>
+              <w:t>Carga Excel, password opcional y genera preview editable.</w:t>
+            </w:r>
+          </w:p>
+        </w:tc>
+      </w:tr>
+      <w:tr>
+        <w:tc>
+          <w:tcPr>
+            <w:tcW w:type="dxa" w:w="3264"/>
+          </w:tcPr>
+          <w:p>
+            <w:r>
+              <w:rPr>
+                <w:rFonts w:ascii="Arial" w:hAnsi="Arial"/>
+                <w:sz w:val="16"/>
+              </w:rPr>
+              <w:t>/api/historical-imports/{id}/commit/</w:t>
+            </w:r>
+          </w:p>
+        </w:tc>
+        <w:tc>
+          <w:tcPr>
+            <w:tcW w:type="dxa" w:w="3264"/>
+          </w:tcPr>
+          <w:p>
+            <w:r>
+              <w:rPr>
+                <w:rFonts w:ascii="Arial" w:hAnsi="Arial"/>
+                <w:sz w:val="16"/>
+              </w:rPr>
+              <w:t>POST</w:t>
+            </w:r>
+          </w:p>
+        </w:tc>
+        <w:tc>
+          <w:tcPr>
+            <w:tcW w:type="dxa" w:w="3264"/>
+          </w:tcPr>
+          <w:p>
+            <w:r>
+              <w:rPr>
+                <w:rFonts w:ascii="Arial" w:hAnsi="Arial"/>
+                <w:sz w:val="16"/>
+              </w:rPr>
+              <w:t>Firma importacion y crea pagos/gastos historicos.</w:t>
+            </w:r>
+          </w:p>
+        </w:tc>
+      </w:tr>
+    </w:tbl>
+    <w:p/>
+    <w:p>
+      <w:pPr>
+        <w:pStyle w:val="Heading1"/>
+      </w:pPr>
+      <w:r>
+        <w:t>3. Archivos clave modificados</w:t>
+      </w:r>
+    </w:p>
+    <w:tbl>
+      <w:tblPr>
+        <w:tblStyle w:val="TableGrid"/>
+        <w:tblW w:type="auto" w:w="0"/>
+        <w:tblLook w:firstColumn="1" w:firstRow="1" w:lastColumn="0" w:lastRow="0" w:noHBand="0" w:noVBand="1" w:val="04A0"/>
+      </w:tblPr>
+      <w:tblGrid>
+        <w:gridCol w:w="4896"/>
+        <w:gridCol w:w="4896"/>
+      </w:tblGrid>
+      <w:tr>
+        <w:tc>
+          <w:tcPr>
+            <w:tcW w:type="dxa" w:w="4896"/>
+          </w:tcPr>
+          <w:p>
+            <w:r>
+              <w:rPr>
+                <w:rFonts w:ascii="Arial" w:hAnsi="Arial"/>
+                <w:sz w:val="16"/>
+              </w:rPr>
+              <w:t>Archivo</w:t>
+            </w:r>
+          </w:p>
+        </w:tc>
+        <w:tc>
+          <w:tcPr>
+            <w:tcW w:type="dxa" w:w="4896"/>
+          </w:tcPr>
+          <w:p>
+            <w:r>
+              <w:rPr>
+                <w:rFonts w:ascii="Arial" w:hAnsi="Arial"/>
+                <w:sz w:val="16"/>
+              </w:rPr>
+              <w:t>Responsabilidad</w:t>
+            </w:r>
+          </w:p>
+        </w:tc>
+      </w:tr>
+      <w:tr>
+        <w:tc>
+          <w:tcPr>
+            <w:tcW w:type="dxa" w:w="4896"/>
+          </w:tcPr>
+          <w:p>
+            <w:r>
+              <w:rPr>
+                <w:rFonts w:ascii="Arial" w:hAnsi="Arial"/>
+                <w:sz w:val="16"/>
+              </w:rPr>
+              <w:t>back/core/models.py</w:t>
+            </w:r>
+          </w:p>
+        </w:tc>
+        <w:tc>
+          <w:tcPr>
+            <w:tcW w:type="dxa" w:w="4896"/>
+          </w:tcPr>
+          <w:p>
+            <w:r>
+              <w:rPr>
+                <w:rFonts w:ascii="Arial" w:hAnsi="Arial"/>
+                <w:sz w:val="16"/>
+              </w:rPr>
+              <w:t>Invoice y FaceRecognitionAttempt; relaciones con cargos, pagos, gastos, alumnos y sesiones.</w:t>
+            </w:r>
+          </w:p>
+        </w:tc>
+      </w:tr>
+      <w:tr>
+        <w:tc>
+          <w:tcPr>
+            <w:tcW w:type="dxa" w:w="4896"/>
+          </w:tcPr>
+          <w:p>
+            <w:r>
+              <w:rPr>
+                <w:rFonts w:ascii="Arial" w:hAnsi="Arial"/>
+                <w:sz w:val="16"/>
+              </w:rPr>
+              <w:t>back/core/views.py</w:t>
+            </w:r>
+          </w:p>
+        </w:tc>
+        <w:tc>
+          <w:tcPr>
+            <w:tcW w:type="dxa" w:w="4896"/>
+          </w:tcPr>
+          <w:p>
+            <w:r>
+              <w:rPr>
+                <w:rFonts w:ascii="Arial" w:hAnsi="Arial"/>
+                <w:sz w:val="16"/>
+              </w:rPr>
+              <w:t>Excel contable, PAC simulado, PDF/XML, diagnostico y reconocimiento DeepFace.</w:t>
+            </w:r>
+          </w:p>
+        </w:tc>
+      </w:tr>
+      <w:tr>
+        <w:tc>
+          <w:tcPr>
+            <w:tcW w:type="dxa" w:w="4896"/>
+          </w:tcPr>
+          <w:p>
+            <w:r>
+              <w:rPr>
+                <w:rFonts w:ascii="Arial" w:hAnsi="Arial"/>
+                <w:sz w:val="16"/>
+              </w:rPr>
+              <w:t>back/core/serializers.py</w:t>
+            </w:r>
+          </w:p>
+        </w:tc>
+        <w:tc>
+          <w:tcPr>
+            <w:tcW w:type="dxa" w:w="4896"/>
+          </w:tcPr>
+          <w:p>
+            <w:r>
+              <w:rPr>
+                <w:rFonts w:ascii="Arial" w:hAnsi="Arial"/>
+                <w:sz w:val="16"/>
+              </w:rPr>
+              <w:t>Serializers para facturas e intentos faciales.</w:t>
+            </w:r>
+          </w:p>
+        </w:tc>
+      </w:tr>
+      <w:tr>
+        <w:tc>
+          <w:tcPr>
+            <w:tcW w:type="dxa" w:w="4896"/>
+          </w:tcPr>
+          <w:p>
+            <w:r>
+              <w:rPr>
+                <w:rFonts w:ascii="Arial" w:hAnsi="Arial"/>
+                <w:sz w:val="16"/>
+              </w:rPr>
+              <w:t>back/futsi_api/settings.py</w:t>
+            </w:r>
+          </w:p>
+        </w:tc>
+        <w:tc>
+          <w:tcPr>
+            <w:tcW w:type="dxa" w:w="4896"/>
+          </w:tcPr>
+          <w:p>
+            <w:r>
+              <w:rPr>
+                <w:rFonts w:ascii="Arial" w:hAnsi="Arial"/>
+                <w:sz w:val="16"/>
+              </w:rPr>
+              <w:t>Config Postgres/Supabase por variables separadas y proteccion ante URL malformada.</w:t>
+            </w:r>
+          </w:p>
+        </w:tc>
+      </w:tr>
+      <w:tr>
+        <w:tc>
+          <w:tcPr>
+            <w:tcW w:type="dxa" w:w="4896"/>
+          </w:tcPr>
+          <w:p>
+            <w:r>
+              <w:rPr>
+                <w:rFonts w:ascii="Arial" w:hAnsi="Arial"/>
+                <w:sz w:val="16"/>
+              </w:rPr>
+              <w:t>front/src/main.tsx</w:t>
+            </w:r>
+          </w:p>
+        </w:tc>
+        <w:tc>
+          <w:tcPr>
+            <w:tcW w:type="dxa" w:w="4896"/>
+          </w:tcPr>
+          <w:p>
+            <w:r>
+              <w:rPr>
+                <w:rFonts w:ascii="Arial" w:hAnsi="Arial"/>
+                <w:sz w:val="16"/>
+              </w:rPr>
+              <w:t>UI de facturas, Excel, PWA, camara, recuadro facial, perfiles y roles.</w:t>
+            </w:r>
+          </w:p>
+        </w:tc>
+      </w:tr>
+      <w:tr>
+        <w:tc>
+          <w:tcPr>
+            <w:tcW w:type="dxa" w:w="4896"/>
+          </w:tcPr>
+          <w:p>
+            <w:r>
+              <w:rPr>
+                <w:rFonts w:ascii="Arial" w:hAnsi="Arial"/>
+                <w:sz w:val="16"/>
+              </w:rPr>
+              <w:t>front/src/styles.css</w:t>
+            </w:r>
+          </w:p>
+        </w:tc>
+        <w:tc>
+          <w:tcPr>
+            <w:tcW w:type="dxa" w:w="4896"/>
+          </w:tcPr>
+          <w:p>
+            <w:r>
+              <w:rPr>
+                <w:rFonts w:ascii="Arial" w:hAnsi="Arial"/>
+                <w:sz w:val="16"/>
+              </w:rPr>
+              <w:t>Responsive mobile, espejo de camara, estados de reconocimiento y tema oscuro.</w:t>
+            </w:r>
+          </w:p>
+        </w:tc>
+      </w:tr>
+      <w:tr>
+        <w:tc>
+          <w:tcPr>
+            <w:tcW w:type="dxa" w:w="4896"/>
+          </w:tcPr>
+          <w:p>
+            <w:r>
+              <w:rPr>
+                <w:rFonts w:ascii="Arial" w:hAnsi="Arial"/>
+                <w:sz w:val="16"/>
+              </w:rPr>
+              <w:t>front/public/*</w:t>
+            </w:r>
+          </w:p>
+        </w:tc>
+        <w:tc>
+          <w:tcPr>
+            <w:tcW w:type="dxa" w:w="4896"/>
+          </w:tcPr>
+          <w:p>
+            <w:r>
+              <w:rPr>
+                <w:rFonts w:ascii="Arial" w:hAnsi="Arial"/>
+                <w:sz w:val="16"/>
+              </w:rPr>
+              <w:t>Manifest, icono y service worker PWA.</w:t>
+            </w:r>
+          </w:p>
+        </w:tc>
+      </w:tr>
+      <w:tr>
+        <w:tc>
+          <w:tcPr>
+            <w:tcW w:type="dxa" w:w="4896"/>
+          </w:tcPr>
+          <w:p>
+            <w:r>
+              <w:rPr>
+                <w:rFonts w:ascii="Arial" w:hAnsi="Arial"/>
+                <w:sz w:val="16"/>
+              </w:rPr>
+              <w:t>front/android/*</w:t>
+            </w:r>
+          </w:p>
+        </w:tc>
+        <w:tc>
+          <w:tcPr>
+            <w:tcW w:type="dxa" w:w="4896"/>
+          </w:tcPr>
+          <w:p>
+            <w:r>
+              <w:rPr>
+                <w:rFonts w:ascii="Arial" w:hAnsi="Arial"/>
+                <w:sz w:val="16"/>
+              </w:rPr>
+              <w:t>Proyecto Android Capacitor y APK debug para emulador/dispositivo.</w:t>
+            </w:r>
+          </w:p>
+        </w:tc>
+      </w:tr>
+      <w:tr>
+        <w:tc>
+          <w:tcPr>
+            <w:tcW w:type="dxa" w:w="4896"/>
+          </w:tcPr>
+          <w:p>
+            <w:r>
+              <w:rPr>
+                <w:rFonts w:ascii="Arial" w:hAnsi="Arial"/>
+                <w:sz w:val="16"/>
+              </w:rPr>
+              <w:t>render.yaml / Dockerfile</w:t>
+            </w:r>
+          </w:p>
+        </w:tc>
+        <w:tc>
+          <w:tcPr>
+            <w:tcW w:type="dxa" w:w="4896"/>
+          </w:tcPr>
+          <w:p>
+            <w:r>
+              <w:rPr>
+                <w:rFonts w:ascii="Arial" w:hAnsi="Arial"/>
+                <w:sz w:val="16"/>
+              </w:rPr>
+              <w:t>Preparacion de deploy Render con migraciones y variables.</w:t>
+            </w:r>
+          </w:p>
+        </w:tc>
+      </w:tr>
+    </w:tbl>
+    <w:p/>
+    <w:p>
+      <w:pPr>
+        <w:pStyle w:val="Heading1"/>
+      </w:pPr>
+      <w:r>
+        <w:t>4. Ejecucion local recomendada</w:t>
       </w:r>
     </w:p>
     <w:p>
@@ -39,7 +901,7 @@
         <w:pStyle w:val="ListBullet"/>
       </w:pPr>
       <w:r>
-        <w:t>back/core/models.py: dominio.</w:t>
+        <w:t>Backend normal: cd back; python -m venv .venv; .\.venv\Scripts\python.exe -m pip install -r requirements.txt; .\.venv\Scripts\python.exe manage.py migrate; .\.venv\Scripts\python.exe manage.py seed_demo --reset; .\.venv\Scripts\python.exe manage.py runserver.</w:t>
       </w:r>
     </w:p>
     <w:p>
@@ -47,7 +909,7 @@
         <w:pStyle w:val="ListBullet"/>
       </w:pPr>
       <w:r>
-        <w:t>back/core/views.py: API y permisos.</w:t>
+        <w:t>Backend con DeepFace local: crear .venv en raiz e instalar requirements + deepface + tf-keras; correr manage.py con --noreload para evitar doble carga.</w:t>
       </w:r>
     </w:p>
     <w:p>
@@ -55,7 +917,7 @@
         <w:pStyle w:val="ListBullet"/>
       </w:pPr>
       <w:r>
-        <w:t>back/core/serializers.py: saldos y pagos.</w:t>
+        <w:t>Frontend: cd front; npm install; npm run dev.</w:t>
       </w:r>
     </w:p>
     <w:p>
@@ -63,7 +925,7 @@
         <w:pStyle w:val="ListBullet"/>
       </w:pPr>
       <w:r>
-        <w:t>front/src/main.tsx: portales y UI.</w:t>
+        <w:t>Validacion: manage.py test, npm run build, abrir http://127.0.0.1:5173 y revisar roles admin/contador/coach/cajero/familia.</w:t>
       </w:r>
     </w:p>
     <w:p>
@@ -71,7 +933,7 @@
         <w:pStyle w:val="ListBullet"/>
       </w:pPr>
       <w:r>
-        <w:t>tools/: generadores de docs.</w:t>
+        <w:t>Android: cd front; npm run build:android; npx cap sync android; abrir front/android en Android Studio o usar tools/build_android_debug_apk.ps1.</w:t>
       </w:r>
     </w:p>
     <w:p>
@@ -79,7 +941,7 @@
         <w:pStyle w:val="Heading1"/>
       </w:pPr>
       <w:r>
-        <w:t>Comandos</w:t>
+        <w:t>5. Notas de DeepFace</w:t>
       </w:r>
     </w:p>
     <w:p>
@@ -87,7 +949,7 @@
         <w:pStyle w:val="ListBullet"/>
       </w:pPr>
       <w:r>
-        <w:t>Backend: manage.py migrate, seed_demo, runserver, test.</w:t>
+        <w:t>DeepFace queda opcional y local porque TensorFlow/DeepFace pesan demasiado para una demo gratis en Render.</w:t>
       </w:r>
     </w:p>
     <w:p>
@@ -95,7 +957,23 @@
         <w:pStyle w:val="ListBullet"/>
       </w:pPr>
       <w:r>
-        <w:t>Frontend: npm install, npm run dev, npm run build.</w:t>
+        <w:t>El backend compara la captura normal y espejada para compensar camaras frontales.</w:t>
+      </w:r>
+    </w:p>
+    <w:p>
+      <w:pPr>
+        <w:pStyle w:val="ListBullet"/>
+      </w:pPr>
+      <w:r>
+        <w:t>Si DeepFace esta instalado pero no hay match confiable, el sistema reporta sin coincidencia; ya no inventa asistencia por fallback.</w:t>
+      </w:r>
+    </w:p>
+    <w:p>
+      <w:pPr>
+        <w:pStyle w:val="ListBullet"/>
+      </w:pPr>
+      <w:r>
+        <w:t>FACE_MATCH_MAX_DISTANCE permite ajustar umbral; default 0.55 para demo.</w:t>
       </w:r>
     </w:p>
     <w:p>
@@ -103,7 +981,7 @@
         <w:pStyle w:val="Heading1"/>
       </w:pPr>
       <w:r>
-        <w:t>Sprint 2 tecnico</w:t>
+        <w:t>6. Importacion historica Excel implementada</w:t>
       </w:r>
     </w:p>
     <w:p>
@@ -111,7 +989,7 @@
         <w:pStyle w:val="ListBullet"/>
       </w:pPr>
       <w:r>
-        <w:t>PostgreSQL.</w:t>
+        <w:t>Modelos HistoricalImport y HistoricalImportRow guardan archivo original, usuario que subio, usuario que firma, password usado, resumen, filas y destino creado.</w:t>
       </w:r>
     </w:p>
     <w:p>
@@ -119,7 +997,7 @@
         <w:pStyle w:val="ListBullet"/>
       </w:pPr>
       <w:r>
-        <w:t>S3.</w:t>
+        <w:t>El endpoint preview carga Excel con openpyxl y msoffcrypto-tool cuando hay cifrado, detecta hojas INGRESOS SEDES/GASTOS SEDES y genera placeholders editables.</w:t>
       </w:r>
     </w:p>
     <w:p>
@@ -127,7 +1005,7 @@
         <w:pStyle w:val="ListBullet"/>
       </w:pPr>
       <w:r>
-        <w:t>Pagos reales.</w:t>
+        <w:t>El endpoint commit exige firma responsable, respeta filas omitidas, crea Payment para ingresos y Expense para egresos, y registra AuditLog.</w:t>
       </w:r>
     </w:p>
     <w:p>
@@ -135,7 +1013,1057 @@
         <w:pStyle w:val="ListBullet"/>
       </w:pPr>
       <w:r>
-        <w:t>Auditoria automatica.</w:t>
+        <w:t>La ampliacion Sprint 3 debe sumar staging completo para ARCHIVO DE OPERACION, ESTADO DE RDOS. y demas hojas historicas.</w:t>
+      </w:r>
+    </w:p>
+    <w:p>
+      <w:pPr>
+        <w:pStyle w:val="Heading1"/>
+      </w:pPr>
+      <w:r>
+        <w:t>7. Seguridad y QA tecnica para Sprint 3</w:t>
+      </w:r>
+    </w:p>
+    <w:tbl>
+      <w:tblPr>
+        <w:tblStyle w:val="TableGrid"/>
+        <w:tblW w:type="auto" w:w="0"/>
+        <w:tblLook w:firstColumn="1" w:firstRow="1" w:lastColumn="0" w:lastRow="0" w:noHBand="0" w:noVBand="1" w:val="04A0"/>
+      </w:tblPr>
+      <w:tblGrid>
+        <w:gridCol w:w="3264"/>
+        <w:gridCol w:w="3264"/>
+        <w:gridCol w:w="3264"/>
+      </w:tblGrid>
+      <w:tr>
+        <w:tc>
+          <w:tcPr>
+            <w:tcW w:type="dxa" w:w="3264"/>
+          </w:tcPr>
+          <w:p>
+            <w:r>
+              <w:rPr>
+                <w:rFonts w:ascii="Arial" w:hAnsi="Arial"/>
+                <w:sz w:val="16"/>
+              </w:rPr>
+              <w:t>Area</w:t>
+            </w:r>
+          </w:p>
+        </w:tc>
+        <w:tc>
+          <w:tcPr>
+            <w:tcW w:type="dxa" w:w="3264"/>
+          </w:tcPr>
+          <w:p>
+            <w:r>
+              <w:rPr>
+                <w:rFonts w:ascii="Arial" w:hAnsi="Arial"/>
+                <w:sz w:val="16"/>
+              </w:rPr>
+              <w:t>Accion Sprint 3</w:t>
+            </w:r>
+          </w:p>
+        </w:tc>
+        <w:tc>
+          <w:tcPr>
+            <w:tcW w:type="dxa" w:w="3264"/>
+          </w:tcPr>
+          <w:p>
+            <w:r>
+              <w:rPr>
+                <w:rFonts w:ascii="Arial" w:hAnsi="Arial"/>
+                <w:sz w:val="16"/>
+              </w:rPr>
+              <w:t>Criterio de salida</w:t>
+            </w:r>
+          </w:p>
+        </w:tc>
+      </w:tr>
+      <w:tr>
+        <w:tc>
+          <w:tcPr>
+            <w:tcW w:type="dxa" w:w="3264"/>
+          </w:tcPr>
+          <w:p>
+            <w:r>
+              <w:rPr>
+                <w:rFonts w:ascii="Arial" w:hAnsi="Arial"/>
+                <w:sz w:val="16"/>
+              </w:rPr>
+              <w:t>SQL injection</w:t>
+            </w:r>
+          </w:p>
+        </w:tc>
+        <w:tc>
+          <w:tcPr>
+            <w:tcW w:type="dxa" w:w="3264"/>
+          </w:tcPr>
+          <w:p>
+            <w:r>
+              <w:rPr>
+                <w:rFonts w:ascii="Arial" w:hAnsi="Arial"/>
+                <w:sz w:val="16"/>
+              </w:rPr>
+              <w:t>Revisar queries crudas, filtros, reportes y parsers; mantener ORM parametrizado y pruebas con payloads maliciosos.</w:t>
+            </w:r>
+          </w:p>
+        </w:tc>
+        <w:tc>
+          <w:tcPr>
+            <w:tcW w:type="dxa" w:w="3264"/>
+          </w:tcPr>
+          <w:p>
+            <w:r>
+              <w:rPr>
+                <w:rFonts w:ascii="Arial" w:hAnsi="Arial"/>
+                <w:sz w:val="16"/>
+              </w:rPr>
+              <w:t>Suite automatizada confirma que filtros/login/importacion no ejecutan SQL no esperado.</w:t>
+            </w:r>
+          </w:p>
+        </w:tc>
+      </w:tr>
+      <w:tr>
+        <w:tc>
+          <w:tcPr>
+            <w:tcW w:type="dxa" w:w="3264"/>
+          </w:tcPr>
+          <w:p>
+            <w:r>
+              <w:rPr>
+                <w:rFonts w:ascii="Arial" w:hAnsi="Arial"/>
+                <w:sz w:val="16"/>
+              </w:rPr>
+              <w:t>Autenticacion</w:t>
+            </w:r>
+          </w:p>
+        </w:tc>
+        <w:tc>
+          <w:tcPr>
+            <w:tcW w:type="dxa" w:w="3264"/>
+          </w:tcPr>
+          <w:p>
+            <w:r>
+              <w:rPr>
+                <w:rFonts w:ascii="Arial" w:hAnsi="Arial"/>
+                <w:sz w:val="16"/>
+              </w:rPr>
+              <w:t>Validar sesiones/token, expiracion, logout, cambio de password y bloqueo de fuerza bruta.</w:t>
+            </w:r>
+          </w:p>
+        </w:tc>
+        <w:tc>
+          <w:tcPr>
+            <w:tcW w:type="dxa" w:w="3264"/>
+          </w:tcPr>
+          <w:p>
+            <w:r>
+              <w:rPr>
+                <w:rFonts w:ascii="Arial" w:hAnsi="Arial"/>
+                <w:sz w:val="16"/>
+              </w:rPr>
+              <w:t>Casos negativos cubiertos y logs de intentos fallidos.</w:t>
+            </w:r>
+          </w:p>
+        </w:tc>
+      </w:tr>
+      <w:tr>
+        <w:tc>
+          <w:tcPr>
+            <w:tcW w:type="dxa" w:w="3264"/>
+          </w:tcPr>
+          <w:p>
+            <w:r>
+              <w:rPr>
+                <w:rFonts w:ascii="Arial" w:hAnsi="Arial"/>
+                <w:sz w:val="16"/>
+              </w:rPr>
+              <w:t>Autorizacion por rol</w:t>
+            </w:r>
+          </w:p>
+        </w:tc>
+        <w:tc>
+          <w:tcPr>
+            <w:tcW w:type="dxa" w:w="3264"/>
+          </w:tcPr>
+          <w:p>
+            <w:r>
+              <w:rPr>
+                <w:rFonts w:ascii="Arial" w:hAnsi="Arial"/>
+                <w:sz w:val="16"/>
+              </w:rPr>
+              <w:t>Pruebas de acceso horizontal/vertical para admin, contador, cajero, coach, tutor y coordinador.</w:t>
+            </w:r>
+          </w:p>
+        </w:tc>
+        <w:tc>
+          <w:tcPr>
+            <w:tcW w:type="dxa" w:w="3264"/>
+          </w:tcPr>
+          <w:p>
+            <w:r>
+              <w:rPr>
+                <w:rFonts w:ascii="Arial" w:hAnsi="Arial"/>
+                <w:sz w:val="16"/>
+              </w:rPr>
+              <w:t>Cada endpoint sensible tiene test de permisos.</w:t>
+            </w:r>
+          </w:p>
+        </w:tc>
+      </w:tr>
+      <w:tr>
+        <w:tc>
+          <w:tcPr>
+            <w:tcW w:type="dxa" w:w="3264"/>
+          </w:tcPr>
+          <w:p>
+            <w:r>
+              <w:rPr>
+                <w:rFonts w:ascii="Arial" w:hAnsi="Arial"/>
+                <w:sz w:val="16"/>
+              </w:rPr>
+              <w:t>Carga de archivos</w:t>
+            </w:r>
+          </w:p>
+        </w:tc>
+        <w:tc>
+          <w:tcPr>
+            <w:tcW w:type="dxa" w:w="3264"/>
+          </w:tcPr>
+          <w:p>
+            <w:r>
+              <w:rPr>
+                <w:rFonts w:ascii="Arial" w:hAnsi="Arial"/>
+                <w:sz w:val="16"/>
+              </w:rPr>
+              <w:t>Validar extension, MIME, tamano, password, hojas permitidas y limpieza de Excel historico.</w:t>
+            </w:r>
+          </w:p>
+        </w:tc>
+        <w:tc>
+          <w:tcPr>
+            <w:tcW w:type="dxa" w:w="3264"/>
+          </w:tcPr>
+          <w:p>
+            <w:r>
+              <w:rPr>
+                <w:rFonts w:ascii="Arial" w:hAnsi="Arial"/>
+                <w:sz w:val="16"/>
+              </w:rPr>
+              <w:t>Archivos corruptos/enormes/protegidos fallan de forma controlada.</w:t>
+            </w:r>
+          </w:p>
+        </w:tc>
+      </w:tr>
+      <w:tr>
+        <w:tc>
+          <w:tcPr>
+            <w:tcW w:type="dxa" w:w="3264"/>
+          </w:tcPr>
+          <w:p>
+            <w:r>
+              <w:rPr>
+                <w:rFonts w:ascii="Arial" w:hAnsi="Arial"/>
+                <w:sz w:val="16"/>
+              </w:rPr>
+              <w:t>Datos personales</w:t>
+            </w:r>
+          </w:p>
+        </w:tc>
+        <w:tc>
+          <w:tcPr>
+            <w:tcW w:type="dxa" w:w="3264"/>
+          </w:tcPr>
+          <w:p>
+            <w:r>
+              <w:rPr>
+                <w:rFonts w:ascii="Arial" w:hAnsi="Arial"/>
+                <w:sz w:val="16"/>
+              </w:rPr>
+              <w:t>Revisar fotos, datos medicos, responsivas y facturas; minimizar exposicion por rol.</w:t>
+            </w:r>
+          </w:p>
+        </w:tc>
+        <w:tc>
+          <w:tcPr>
+            <w:tcW w:type="dxa" w:w="3264"/>
+          </w:tcPr>
+          <w:p>
+            <w:r>
+              <w:rPr>
+                <w:rFonts w:ascii="Arial" w:hAnsi="Arial"/>
+                <w:sz w:val="16"/>
+              </w:rPr>
+              <w:t>Cajero/coach/tutor solo ven datos necesarios.</w:t>
+            </w:r>
+          </w:p>
+        </w:tc>
+      </w:tr>
+      <w:tr>
+        <w:tc>
+          <w:tcPr>
+            <w:tcW w:type="dxa" w:w="3264"/>
+          </w:tcPr>
+          <w:p>
+            <w:r>
+              <w:rPr>
+                <w:rFonts w:ascii="Arial" w:hAnsi="Arial"/>
+                <w:sz w:val="16"/>
+              </w:rPr>
+              <w:t>CORS/CSRF</w:t>
+            </w:r>
+          </w:p>
+        </w:tc>
+        <w:tc>
+          <w:tcPr>
+            <w:tcW w:type="dxa" w:w="3264"/>
+          </w:tcPr>
+          <w:p>
+            <w:r>
+              <w:rPr>
+                <w:rFonts w:ascii="Arial" w:hAnsi="Arial"/>
+                <w:sz w:val="16"/>
+              </w:rPr>
+              <w:t>Endurecer origenes permitidos, headers, HTTPS y cookies si se cambia estrategia de auth.</w:t>
+            </w:r>
+          </w:p>
+        </w:tc>
+        <w:tc>
+          <w:tcPr>
+            <w:tcW w:type="dxa" w:w="3264"/>
+          </w:tcPr>
+          <w:p>
+            <w:r>
+              <w:rPr>
+                <w:rFonts w:ascii="Arial" w:hAnsi="Arial"/>
+                <w:sz w:val="16"/>
+              </w:rPr>
+              <w:t>Produccion no acepta origenes comodin.</w:t>
+            </w:r>
+          </w:p>
+        </w:tc>
+      </w:tr>
+      <w:tr>
+        <w:tc>
+          <w:tcPr>
+            <w:tcW w:type="dxa" w:w="3264"/>
+          </w:tcPr>
+          <w:p>
+            <w:r>
+              <w:rPr>
+                <w:rFonts w:ascii="Arial" w:hAnsi="Arial"/>
+                <w:sz w:val="16"/>
+              </w:rPr>
+              <w:t>Secretos</w:t>
+            </w:r>
+          </w:p>
+        </w:tc>
+        <w:tc>
+          <w:tcPr>
+            <w:tcW w:type="dxa" w:w="3264"/>
+          </w:tcPr>
+          <w:p>
+            <w:r>
+              <w:rPr>
+                <w:rFonts w:ascii="Arial" w:hAnsi="Arial"/>
+                <w:sz w:val="16"/>
+              </w:rPr>
+              <w:t>Validar Render/GitHub/Supabase sin secretos en repo.</w:t>
+            </w:r>
+          </w:p>
+        </w:tc>
+        <w:tc>
+          <w:tcPr>
+            <w:tcW w:type="dxa" w:w="3264"/>
+          </w:tcPr>
+          <w:p>
+            <w:r>
+              <w:rPr>
+                <w:rFonts w:ascii="Arial" w:hAnsi="Arial"/>
+                <w:sz w:val="16"/>
+              </w:rPr>
+              <w:t>git-secrets/trufflehog o equivalente sin hallazgos criticos.</w:t>
+            </w:r>
+          </w:p>
+        </w:tc>
+      </w:tr>
+      <w:tr>
+        <w:tc>
+          <w:tcPr>
+            <w:tcW w:type="dxa" w:w="3264"/>
+          </w:tcPr>
+          <w:p>
+            <w:r>
+              <w:rPr>
+                <w:rFonts w:ascii="Arial" w:hAnsi="Arial"/>
+                <w:sz w:val="16"/>
+              </w:rPr>
+              <w:t>Dependencias</w:t>
+            </w:r>
+          </w:p>
+        </w:tc>
+        <w:tc>
+          <w:tcPr>
+            <w:tcW w:type="dxa" w:w="3264"/>
+          </w:tcPr>
+          <w:p>
+            <w:r>
+              <w:rPr>
+                <w:rFonts w:ascii="Arial" w:hAnsi="Arial"/>
+                <w:sz w:val="16"/>
+              </w:rPr>
+              <w:t>Ejecutar npm audit/pip-audit y fijar actualizaciones criticas.</w:t>
+            </w:r>
+          </w:p>
+        </w:tc>
+        <w:tc>
+          <w:tcPr>
+            <w:tcW w:type="dxa" w:w="3264"/>
+          </w:tcPr>
+          <w:p>
+            <w:r>
+              <w:rPr>
+                <w:rFonts w:ascii="Arial" w:hAnsi="Arial"/>
+                <w:sz w:val="16"/>
+              </w:rPr>
+              <w:t>Sin vulnerabilidades altas conocidas o con excepcion documentada.</w:t>
+            </w:r>
+          </w:p>
+        </w:tc>
+      </w:tr>
+    </w:tbl>
+    <w:p/>
+    <w:tbl>
+      <w:tblPr>
+        <w:tblStyle w:val="TableGrid"/>
+        <w:tblW w:type="auto" w:w="0"/>
+        <w:tblLook w:firstColumn="1" w:firstRow="1" w:lastColumn="0" w:lastRow="0" w:noHBand="0" w:noVBand="1" w:val="04A0"/>
+      </w:tblPr>
+      <w:tblGrid>
+        <w:gridCol w:w="3264"/>
+        <w:gridCol w:w="3264"/>
+        <w:gridCol w:w="3264"/>
+      </w:tblGrid>
+      <w:tr>
+        <w:tc>
+          <w:tcPr>
+            <w:tcW w:type="dxa" w:w="3264"/>
+          </w:tcPr>
+          <w:p>
+            <w:r>
+              <w:rPr>
+                <w:rFonts w:ascii="Arial" w:hAnsi="Arial"/>
+                <w:sz w:val="16"/>
+              </w:rPr>
+              <w:t>Herramienta</w:t>
+            </w:r>
+          </w:p>
+        </w:tc>
+        <w:tc>
+          <w:tcPr>
+            <w:tcW w:type="dxa" w:w="3264"/>
+          </w:tcPr>
+          <w:p>
+            <w:r>
+              <w:rPr>
+                <w:rFonts w:ascii="Arial" w:hAnsi="Arial"/>
+                <w:sz w:val="16"/>
+              </w:rPr>
+              <w:t>Uso propuesto</w:t>
+            </w:r>
+          </w:p>
+        </w:tc>
+        <w:tc>
+          <w:tcPr>
+            <w:tcW w:type="dxa" w:w="3264"/>
+          </w:tcPr>
+          <w:p>
+            <w:r>
+              <w:rPr>
+                <w:rFonts w:ascii="Arial" w:hAnsi="Arial"/>
+                <w:sz w:val="16"/>
+              </w:rPr>
+              <w:t>Resultado esperado</w:t>
+            </w:r>
+          </w:p>
+        </w:tc>
+      </w:tr>
+      <w:tr>
+        <w:tc>
+          <w:tcPr>
+            <w:tcW w:type="dxa" w:w="3264"/>
+          </w:tcPr>
+          <w:p>
+            <w:r>
+              <w:rPr>
+                <w:rFonts w:ascii="Arial" w:hAnsi="Arial"/>
+                <w:sz w:val="16"/>
+              </w:rPr>
+              <w:t>SonarQube / SonarCloud</w:t>
+            </w:r>
+          </w:p>
+        </w:tc>
+        <w:tc>
+          <w:tcPr>
+            <w:tcW w:type="dxa" w:w="3264"/>
+          </w:tcPr>
+          <w:p>
+            <w:r>
+              <w:rPr>
+                <w:rFonts w:ascii="Arial" w:hAnsi="Arial"/>
+                <w:sz w:val="16"/>
+              </w:rPr>
+              <w:t>Analisis estatico de frontend/backend en GitHub Actions: bugs, smells, cobertura, duplicacion y hotspots.</w:t>
+            </w:r>
+          </w:p>
+        </w:tc>
+        <w:tc>
+          <w:tcPr>
+            <w:tcW w:type="dxa" w:w="3264"/>
+          </w:tcPr>
+          <w:p>
+            <w:r>
+              <w:rPr>
+                <w:rFonts w:ascii="Arial" w:hAnsi="Arial"/>
+                <w:sz w:val="16"/>
+              </w:rPr>
+              <w:t>Quality Gate visible por PR/main.</w:t>
+            </w:r>
+          </w:p>
+        </w:tc>
+      </w:tr>
+      <w:tr>
+        <w:tc>
+          <w:tcPr>
+            <w:tcW w:type="dxa" w:w="3264"/>
+          </w:tcPr>
+          <w:p>
+            <w:r>
+              <w:rPr>
+                <w:rFonts w:ascii="Arial" w:hAnsi="Arial"/>
+                <w:sz w:val="16"/>
+              </w:rPr>
+              <w:t>pytest + Django</w:t>
+            </w:r>
+          </w:p>
+        </w:tc>
+        <w:tc>
+          <w:tcPr>
+            <w:tcW w:type="dxa" w:w="3264"/>
+          </w:tcPr>
+          <w:p>
+            <w:r>
+              <w:rPr>
+                <w:rFonts w:ascii="Arial" w:hAnsi="Arial"/>
+                <w:sz w:val="16"/>
+              </w:rPr>
+              <w:t>Tests unitarios/API para modelos, permisos, pagos, facturas, importacion Excel, reportes y auditoria.</w:t>
+            </w:r>
+          </w:p>
+        </w:tc>
+        <w:tc>
+          <w:tcPr>
+            <w:tcW w:type="dxa" w:w="3264"/>
+          </w:tcPr>
+          <w:p>
+            <w:r>
+              <w:rPr>
+                <w:rFonts w:ascii="Arial" w:hAnsi="Arial"/>
+                <w:sz w:val="16"/>
+              </w:rPr>
+              <w:t>Suite backend reproducible en CI.</w:t>
+            </w:r>
+          </w:p>
+        </w:tc>
+      </w:tr>
+      <w:tr>
+        <w:tc>
+          <w:tcPr>
+            <w:tcW w:type="dxa" w:w="3264"/>
+          </w:tcPr>
+          <w:p>
+            <w:r>
+              <w:rPr>
+                <w:rFonts w:ascii="Arial" w:hAnsi="Arial"/>
+                <w:sz w:val="16"/>
+              </w:rPr>
+              <w:t>Playwright Python</w:t>
+            </w:r>
+          </w:p>
+        </w:tc>
+        <w:tc>
+          <w:tcPr>
+            <w:tcW w:type="dxa" w:w="3264"/>
+          </w:tcPr>
+          <w:p>
+            <w:r>
+              <w:rPr>
+                <w:rFonts w:ascii="Arial" w:hAnsi="Arial"/>
+                <w:sz w:val="16"/>
+              </w:rPr>
+              <w:t>Pruebas e2e usando elementos reales de la web: login por rol, navegacion movil, pagos, asistencia, Excel historico y facturas.</w:t>
+            </w:r>
+          </w:p>
+        </w:tc>
+        <w:tc>
+          <w:tcPr>
+            <w:tcW w:type="dxa" w:w="3264"/>
+          </w:tcPr>
+          <w:p>
+            <w:r>
+              <w:rPr>
+                <w:rFonts w:ascii="Arial" w:hAnsi="Arial"/>
+                <w:sz w:val="16"/>
+              </w:rPr>
+              <w:t>Flujos criticos pasan en Chrome headless.</w:t>
+            </w:r>
+          </w:p>
+        </w:tc>
+      </w:tr>
+      <w:tr>
+        <w:tc>
+          <w:tcPr>
+            <w:tcW w:type="dxa" w:w="3264"/>
+          </w:tcPr>
+          <w:p>
+            <w:r>
+              <w:rPr>
+                <w:rFonts w:ascii="Arial" w:hAnsi="Arial"/>
+                <w:sz w:val="16"/>
+              </w:rPr>
+              <w:t>Pruebas agresivas UI</w:t>
+            </w:r>
+          </w:p>
+        </w:tc>
+        <w:tc>
+          <w:tcPr>
+            <w:tcW w:type="dxa" w:w="3264"/>
+          </w:tcPr>
+          <w:p>
+            <w:r>
+              <w:rPr>
+                <w:rFonts w:ascii="Arial" w:hAnsi="Arial"/>
+                <w:sz w:val="16"/>
+              </w:rPr>
+              <w:t>Scripts que llenan formularios con valores largos, caracteres raros, fechas invalidas, montos negativos, clicks rapidos y reloads.</w:t>
+            </w:r>
+          </w:p>
+        </w:tc>
+        <w:tc>
+          <w:tcPr>
+            <w:tcW w:type="dxa" w:w="3264"/>
+          </w:tcPr>
+          <w:p>
+            <w:r>
+              <w:rPr>
+                <w:rFonts w:ascii="Arial" w:hAnsi="Arial"/>
+                <w:sz w:val="16"/>
+              </w:rPr>
+              <w:t>La app no se rompe visualmente ni guarda datos invalidos.</w:t>
+            </w:r>
+          </w:p>
+        </w:tc>
+      </w:tr>
+      <w:tr>
+        <w:tc>
+          <w:tcPr>
+            <w:tcW w:type="dxa" w:w="3264"/>
+          </w:tcPr>
+          <w:p>
+            <w:r>
+              <w:rPr>
+                <w:rFonts w:ascii="Arial" w:hAnsi="Arial"/>
+                <w:sz w:val="16"/>
+              </w:rPr>
+              <w:t>OWASP ZAP baseline</w:t>
+            </w:r>
+          </w:p>
+        </w:tc>
+        <w:tc>
+          <w:tcPr>
+            <w:tcW w:type="dxa" w:w="3264"/>
+          </w:tcPr>
+          <w:p>
+            <w:r>
+              <w:rPr>
+                <w:rFonts w:ascii="Arial" w:hAnsi="Arial"/>
+                <w:sz w:val="16"/>
+              </w:rPr>
+              <w:t>Escaneo automatizado contra entorno staging local/Render.</w:t>
+            </w:r>
+          </w:p>
+        </w:tc>
+        <w:tc>
+          <w:tcPr>
+            <w:tcW w:type="dxa" w:w="3264"/>
+          </w:tcPr>
+          <w:p>
+            <w:r>
+              <w:rPr>
+                <w:rFonts w:ascii="Arial" w:hAnsi="Arial"/>
+                <w:sz w:val="16"/>
+              </w:rPr>
+              <w:t>Reporte sin riesgos altos antes de piloto.</w:t>
+            </w:r>
+          </w:p>
+        </w:tc>
+      </w:tr>
+      <w:tr>
+        <w:tc>
+          <w:tcPr>
+            <w:tcW w:type="dxa" w:w="3264"/>
+          </w:tcPr>
+          <w:p>
+            <w:r>
+              <w:rPr>
+                <w:rFonts w:ascii="Arial" w:hAnsi="Arial"/>
+                <w:sz w:val="16"/>
+              </w:rPr>
+              <w:t>Lighthouse</w:t>
+            </w:r>
+          </w:p>
+        </w:tc>
+        <w:tc>
+          <w:tcPr>
+            <w:tcW w:type="dxa" w:w="3264"/>
+          </w:tcPr>
+          <w:p>
+            <w:r>
+              <w:rPr>
+                <w:rFonts w:ascii="Arial" w:hAnsi="Arial"/>
+                <w:sz w:val="16"/>
+              </w:rPr>
+              <w:t>Revisar PWA, accesibilidad y performance movil.</w:t>
+            </w:r>
+          </w:p>
+        </w:tc>
+        <w:tc>
+          <w:tcPr>
+            <w:tcW w:type="dxa" w:w="3264"/>
+          </w:tcPr>
+          <w:p>
+            <w:r>
+              <w:rPr>
+                <w:rFonts w:ascii="Arial" w:hAnsi="Arial"/>
+                <w:sz w:val="16"/>
+              </w:rPr>
+              <w:t>PWA instalable y sin problemas severos de accesibilidad.</w:t>
+            </w:r>
+          </w:p>
+        </w:tc>
+      </w:tr>
+      <w:tr>
+        <w:tc>
+          <w:tcPr>
+            <w:tcW w:type="dxa" w:w="3264"/>
+          </w:tcPr>
+          <w:p>
+            <w:r>
+              <w:rPr>
+                <w:rFonts w:ascii="Arial" w:hAnsi="Arial"/>
+                <w:sz w:val="16"/>
+              </w:rPr>
+              <w:t>Android smoke</w:t>
+            </w:r>
+          </w:p>
+        </w:tc>
+        <w:tc>
+          <w:tcPr>
+            <w:tcW w:type="dxa" w:w="3264"/>
+          </w:tcPr>
+          <w:p>
+            <w:r>
+              <w:rPr>
+                <w:rFonts w:ascii="Arial" w:hAnsi="Arial"/>
+                <w:sz w:val="16"/>
+              </w:rPr>
+              <w:t>Instalar APK debug en emulador y validar login, menu, tema oscuro y camara.</w:t>
+            </w:r>
+          </w:p>
+        </w:tc>
+        <w:tc>
+          <w:tcPr>
+            <w:tcW w:type="dxa" w:w="3264"/>
+          </w:tcPr>
+          <w:p>
+            <w:r>
+              <w:rPr>
+                <w:rFonts w:ascii="Arial" w:hAnsi="Arial"/>
+                <w:sz w:val="16"/>
+              </w:rPr>
+              <w:t>APK usable antes de compartir demo.</w:t>
+            </w:r>
+          </w:p>
+        </w:tc>
+      </w:tr>
+    </w:tbl>
+    <w:p/>
+    <w:p>
+      <w:pPr>
+        <w:pStyle w:val="Heading1"/>
+      </w:pPr>
+      <w:r>
+        <w:t>6. Contrato de Excel contable</w:t>
+      </w:r>
+    </w:p>
+    <w:tbl>
+      <w:tblPr>
+        <w:tblStyle w:val="TableGrid"/>
+        <w:tblW w:type="auto" w:w="0"/>
+        <w:tblLook w:firstColumn="1" w:firstRow="1" w:lastColumn="0" w:lastRow="0" w:noHBand="0" w:noVBand="1" w:val="04A0"/>
+      </w:tblPr>
+      <w:tblGrid>
+        <w:gridCol w:w="4896"/>
+        <w:gridCol w:w="4896"/>
+      </w:tblGrid>
+      <w:tr>
+        <w:tc>
+          <w:tcPr>
+            <w:tcW w:type="dxa" w:w="4896"/>
+          </w:tcPr>
+          <w:p>
+            <w:r>
+              <w:rPr>
+                <w:rFonts w:ascii="Arial" w:hAnsi="Arial"/>
+                <w:sz w:val="16"/>
+              </w:rPr>
+              <w:t>Hoja</w:t>
+            </w:r>
+          </w:p>
+        </w:tc>
+        <w:tc>
+          <w:tcPr>
+            <w:tcW w:type="dxa" w:w="4896"/>
+          </w:tcPr>
+          <w:p>
+            <w:r>
+              <w:rPr>
+                <w:rFonts w:ascii="Arial" w:hAnsi="Arial"/>
+                <w:sz w:val="16"/>
+              </w:rPr>
+              <w:t>Contenido</w:t>
+            </w:r>
+          </w:p>
+        </w:tc>
+      </w:tr>
+      <w:tr>
+        <w:tc>
+          <w:tcPr>
+            <w:tcW w:type="dxa" w:w="4896"/>
+          </w:tcPr>
+          <w:p>
+            <w:r>
+              <w:rPr>
+                <w:rFonts w:ascii="Arial" w:hAnsi="Arial"/>
+                <w:sz w:val="16"/>
+              </w:rPr>
+              <w:t>Resumen</w:t>
+            </w:r>
+          </w:p>
+        </w:tc>
+        <w:tc>
+          <w:tcPr>
+            <w:tcW w:type="dxa" w:w="4896"/>
+          </w:tcPr>
+          <w:p>
+            <w:r>
+              <w:rPr>
+                <w:rFonts w:ascii="Arial" w:hAnsi="Arial"/>
+                <w:sz w:val="16"/>
+              </w:rPr>
+              <w:t>Ingresos confirmados, egresos aprobados, utilidad, gastos pendientes, cargos abiertos por sede.</w:t>
+            </w:r>
+          </w:p>
+        </w:tc>
+      </w:tr>
+      <w:tr>
+        <w:tc>
+          <w:tcPr>
+            <w:tcW w:type="dxa" w:w="4896"/>
+          </w:tcPr>
+          <w:p>
+            <w:r>
+              <w:rPr>
+                <w:rFonts w:ascii="Arial" w:hAnsi="Arial"/>
+                <w:sz w:val="16"/>
+              </w:rPr>
+              <w:t>Pagos</w:t>
+            </w:r>
+          </w:p>
+        </w:tc>
+        <w:tc>
+          <w:tcPr>
+            <w:tcW w:type="dxa" w:w="4896"/>
+          </w:tcPr>
+          <w:p>
+            <w:r>
+              <w:rPr>
+                <w:rFonts w:ascii="Arial" w:hAnsi="Arial"/>
+                <w:sz w:val="16"/>
+              </w:rPr>
+              <w:t>Pago individual con cliente, concepto, metodo, canal, estado, monto, fechas y receptor.</w:t>
+            </w:r>
+          </w:p>
+        </w:tc>
+      </w:tr>
+      <w:tr>
+        <w:tc>
+          <w:tcPr>
+            <w:tcW w:type="dxa" w:w="4896"/>
+          </w:tcPr>
+          <w:p>
+            <w:r>
+              <w:rPr>
+                <w:rFonts w:ascii="Arial" w:hAnsi="Arial"/>
+                <w:sz w:val="16"/>
+              </w:rPr>
+              <w:t>Cargos</w:t>
+            </w:r>
+          </w:p>
+        </w:tc>
+        <w:tc>
+          <w:tcPr>
+            <w:tcW w:type="dxa" w:w="4896"/>
+          </w:tcPr>
+          <w:p>
+            <w:r>
+              <w:rPr>
+                <w:rFonts w:ascii="Arial" w:hAnsi="Arial"/>
+                <w:sz w:val="16"/>
+              </w:rPr>
+              <w:t>Adeudos programados por alumno/equipo, concepto, monto, vencimiento y estado.</w:t>
+            </w:r>
+          </w:p>
+        </w:tc>
+      </w:tr>
+      <w:tr>
+        <w:tc>
+          <w:tcPr>
+            <w:tcW w:type="dxa" w:w="4896"/>
+          </w:tcPr>
+          <w:p>
+            <w:r>
+              <w:rPr>
+                <w:rFonts w:ascii="Arial" w:hAnsi="Arial"/>
+                <w:sz w:val="16"/>
+              </w:rPr>
+              <w:t>Gastos</w:t>
+            </w:r>
+          </w:p>
+        </w:tc>
+        <w:tc>
+          <w:tcPr>
+            <w:tcW w:type="dxa" w:w="4896"/>
+          </w:tcPr>
+          <w:p>
+            <w:r>
+              <w:rPr>
+                <w:rFonts w:ascii="Arial" w:hAnsi="Arial"/>
+                <w:sz w:val="16"/>
+              </w:rPr>
+              <w:t>Gasto por sede, categoria, proveedor, monto, estado, capturo/aprobo.</w:t>
+            </w:r>
+          </w:p>
+        </w:tc>
+      </w:tr>
+      <w:tr>
+        <w:tc>
+          <w:tcPr>
+            <w:tcW w:type="dxa" w:w="4896"/>
+          </w:tcPr>
+          <w:p>
+            <w:r>
+              <w:rPr>
+                <w:rFonts w:ascii="Arial" w:hAnsi="Arial"/>
+                <w:sz w:val="16"/>
+              </w:rPr>
+              <w:t>Descuentos</w:t>
+            </w:r>
+          </w:p>
+        </w:tc>
+        <w:tc>
+          <w:tcPr>
+            <w:tcW w:type="dxa" w:w="4896"/>
+          </w:tcPr>
+          <w:p>
+            <w:r>
+              <w:rPr>
+                <w:rFonts w:ascii="Arial" w:hAnsi="Arial"/>
+                <w:sz w:val="16"/>
+              </w:rPr>
+              <w:t>Solicitudes y aprobaciones de descuento con motivo y usuario.</w:t>
+            </w:r>
+          </w:p>
+        </w:tc>
+      </w:tr>
+      <w:tr>
+        <w:tc>
+          <w:tcPr>
+            <w:tcW w:type="dxa" w:w="4896"/>
+          </w:tcPr>
+          <w:p>
+            <w:r>
+              <w:rPr>
+                <w:rFonts w:ascii="Arial" w:hAnsi="Arial"/>
+                <w:sz w:val="16"/>
+              </w:rPr>
+              <w:t>Asistencia con adeudo</w:t>
+            </w:r>
+          </w:p>
+        </w:tc>
+        <w:tc>
+          <w:tcPr>
+            <w:tcW w:type="dxa" w:w="4896"/>
+          </w:tcPr>
+          <w:p>
+            <w:r>
+              <w:rPr>
+                <w:rFonts w:ascii="Arial" w:hAnsi="Arial"/>
+                <w:sz w:val="16"/>
+              </w:rPr>
+              <w:t>Registros donde un alumno asistio teniendo saldo abierto.</w:t>
+            </w:r>
+          </w:p>
+        </w:tc>
+      </w:tr>
+      <w:tr>
+        <w:tc>
+          <w:tcPr>
+            <w:tcW w:type="dxa" w:w="4896"/>
+          </w:tcPr>
+          <w:p>
+            <w:r>
+              <w:rPr>
+                <w:rFonts w:ascii="Arial" w:hAnsi="Arial"/>
+                <w:sz w:val="16"/>
+              </w:rPr>
+              <w:t>Facturas</w:t>
+            </w:r>
+          </w:p>
+        </w:tc>
+        <w:tc>
+          <w:tcPr>
+            <w:tcW w:type="dxa" w:w="4896"/>
+          </w:tcPr>
+          <w:p>
+            <w:r>
+              <w:rPr>
+                <w:rFonts w:ascii="Arial" w:hAnsi="Arial"/>
+                <w:sz w:val="16"/>
+              </w:rPr>
+              <w:t>UUID, tipo, receptor, concepto, subtotal, impuesto, total y fecha.</w:t>
+            </w:r>
+          </w:p>
+        </w:tc>
+      </w:tr>
+    </w:tbl>
+    <w:p/>
+    <w:p>
+      <w:pPr>
+        <w:pStyle w:val="Heading1"/>
+      </w:pPr>
+      <w:r>
+        <w:t>7. Contrato de facturacion simulada</w:t>
       </w:r>
     </w:p>
     <w:p>
@@ -143,7 +2071,7 @@
         <w:pStyle w:val="ListBullet"/>
       </w:pPr>
       <w:r>
-        <w:t>Importador Excel.</w:t>
+        <w:t>source_type=expense genera factura de egreso ligada a Expense.</w:t>
       </w:r>
     </w:p>
     <w:p>
@@ -151,12 +2079,484 @@
         <w:pStyle w:val="ListBullet"/>
       </w:pPr>
       <w:r>
-        <w:t>Refactor frontend.</w:t>
+        <w:t>source_type=charge genera factura de ingreso ligada a Charge, Student y Guardian cuando aplica.</w:t>
+      </w:r>
+    </w:p>
+    <w:p>
+      <w:pPr>
+        <w:pStyle w:val="ListBullet"/>
+      </w:pPr>
+      <w:r>
+        <w:t>El UUID se genera con uuid4 y no representa timbrado fiscal real.</w:t>
+      </w:r>
+    </w:p>
+    <w:p>
+      <w:pPr>
+        <w:pStyle w:val="ListBullet"/>
+      </w:pPr>
+      <w:r>
+        <w:t>El XML se guarda como texto en DB; el PDF se guarda como archivo generado por reportlab.</w:t>
+      </w:r>
+    </w:p>
+    <w:p>
+      <w:pPr>
+        <w:pStyle w:val="ListBullet"/>
+      </w:pPr>
+      <w:r>
+        <w:t>Los roles guardian y coach solo ven facturas asociadas a ellos; cajero ve facturas de su sede.</w:t>
+      </w:r>
+    </w:p>
+    <w:p>
+      <w:pPr>
+        <w:pStyle w:val="Heading1"/>
+      </w:pPr>
+      <w:r>
+        <w:t>8. Pipeline facial</w:t>
+      </w:r>
+    </w:p>
+    <w:p>
+      <w:pPr>
+        <w:pStyle w:val="ListNumber"/>
+      </w:pPr>
+      <w:r>
+        <w:t>Frontend abre camara y muestra video espejo.</w:t>
+      </w:r>
+    </w:p>
+    <w:p>
+      <w:pPr>
+        <w:pStyle w:val="ListNumber"/>
+      </w:pPr>
+      <w:r>
+        <w:t>Al presionar Pasar lista se captura un frame en canvas.</w:t>
+      </w:r>
+    </w:p>
+    <w:p>
+      <w:pPr>
+        <w:pStyle w:val="ListNumber"/>
+      </w:pPr>
+      <w:r>
+        <w:t>Frontend envia session, image base64 y opcional student forzado.</w:t>
+      </w:r>
+    </w:p>
+    <w:p>
+      <w:pPr>
+        <w:pStyle w:val="ListNumber"/>
+      </w:pPr>
+      <w:r>
+        <w:t>Backend obtiene roster por sede/grupo y filtra alumnos activos/prueba/pausa/lesion.</w:t>
+      </w:r>
+    </w:p>
+    <w:p>
+      <w:pPr>
+        <w:pStyle w:val="ListNumber"/>
+      </w:pPr>
+      <w:r>
+        <w:t>Backend compara contra fotos de alumnos con DeepFace y tambien prueba imagen espejada.</w:t>
+      </w:r>
+    </w:p>
+    <w:p>
+      <w:pPr>
+        <w:pStyle w:val="ListNumber"/>
+      </w:pPr>
+      <w:r>
+        <w:t>Si distancia &lt;= FACE_MATCH_MAX_DISTANCE registra asistencia presente y bitacora.</w:t>
+      </w:r>
+    </w:p>
+    <w:p>
+      <w:pPr>
+        <w:pStyle w:val="ListNumber"/>
+      </w:pPr>
+      <w:r>
+        <w:t>Si no hay match, devuelve Sin coincidencia y no inventa asistencia.</w:t>
+      </w:r>
+    </w:p>
+    <w:p>
+      <w:pPr>
+        <w:pStyle w:val="Heading1"/>
+      </w:pPr>
+      <w:r>
+        <w:t>9. Variables de entorno relevantes</w:t>
+      </w:r>
+    </w:p>
+    <w:tbl>
+      <w:tblPr>
+        <w:tblStyle w:val="TableGrid"/>
+        <w:tblW w:type="auto" w:w="0"/>
+        <w:tblLook w:firstColumn="1" w:firstRow="1" w:lastColumn="0" w:lastRow="0" w:noHBand="0" w:noVBand="1" w:val="04A0"/>
+      </w:tblPr>
+      <w:tblGrid>
+        <w:gridCol w:w="4896"/>
+        <w:gridCol w:w="4896"/>
+      </w:tblGrid>
+      <w:tr>
+        <w:tc>
+          <w:tcPr>
+            <w:tcW w:type="dxa" w:w="4896"/>
+          </w:tcPr>
+          <w:p>
+            <w:r>
+              <w:rPr>
+                <w:rFonts w:ascii="Arial" w:hAnsi="Arial"/>
+                <w:sz w:val="16"/>
+              </w:rPr>
+              <w:t>Variable</w:t>
+            </w:r>
+          </w:p>
+        </w:tc>
+        <w:tc>
+          <w:tcPr>
+            <w:tcW w:type="dxa" w:w="4896"/>
+          </w:tcPr>
+          <w:p>
+            <w:r>
+              <w:rPr>
+                <w:rFonts w:ascii="Arial" w:hAnsi="Arial"/>
+                <w:sz w:val="16"/>
+              </w:rPr>
+              <w:t>Uso</w:t>
+            </w:r>
+          </w:p>
+        </w:tc>
+      </w:tr>
+      <w:tr>
+        <w:tc>
+          <w:tcPr>
+            <w:tcW w:type="dxa" w:w="4896"/>
+          </w:tcPr>
+          <w:p>
+            <w:r>
+              <w:rPr>
+                <w:rFonts w:ascii="Arial" w:hAnsi="Arial"/>
+                <w:sz w:val="16"/>
+              </w:rPr>
+              <w:t>DJANGO_SECRET_KEY</w:t>
+            </w:r>
+          </w:p>
+        </w:tc>
+        <w:tc>
+          <w:tcPr>
+            <w:tcW w:type="dxa" w:w="4896"/>
+          </w:tcPr>
+          <w:p>
+            <w:r>
+              <w:rPr>
+                <w:rFonts w:ascii="Arial" w:hAnsi="Arial"/>
+                <w:sz w:val="16"/>
+              </w:rPr>
+              <w:t>Clave secreta backend.</w:t>
+            </w:r>
+          </w:p>
+        </w:tc>
+      </w:tr>
+      <w:tr>
+        <w:tc>
+          <w:tcPr>
+            <w:tcW w:type="dxa" w:w="4896"/>
+          </w:tcPr>
+          <w:p>
+            <w:r>
+              <w:rPr>
+                <w:rFonts w:ascii="Arial" w:hAnsi="Arial"/>
+                <w:sz w:val="16"/>
+              </w:rPr>
+              <w:t>DJANGO_DEBUG</w:t>
+            </w:r>
+          </w:p>
+        </w:tc>
+        <w:tc>
+          <w:tcPr>
+            <w:tcW w:type="dxa" w:w="4896"/>
+          </w:tcPr>
+          <w:p>
+            <w:r>
+              <w:rPr>
+                <w:rFonts w:ascii="Arial" w:hAnsi="Arial"/>
+                <w:sz w:val="16"/>
+              </w:rPr>
+              <w:t>false en produccion.</w:t>
+            </w:r>
+          </w:p>
+        </w:tc>
+      </w:tr>
+      <w:tr>
+        <w:tc>
+          <w:tcPr>
+            <w:tcW w:type="dxa" w:w="4896"/>
+          </w:tcPr>
+          <w:p>
+            <w:r>
+              <w:rPr>
+                <w:rFonts w:ascii="Arial" w:hAnsi="Arial"/>
+                <w:sz w:val="16"/>
+              </w:rPr>
+              <w:t>DJANGO_ALLOWED_HOSTS</w:t>
+            </w:r>
+          </w:p>
+        </w:tc>
+        <w:tc>
+          <w:tcPr>
+            <w:tcW w:type="dxa" w:w="4896"/>
+          </w:tcPr>
+          <w:p>
+            <w:r>
+              <w:rPr>
+                <w:rFonts w:ascii="Arial" w:hAnsi="Arial"/>
+                <w:sz w:val="16"/>
+              </w:rPr>
+              <w:t>Hosts Render/dominio.</w:t>
+            </w:r>
+          </w:p>
+        </w:tc>
+      </w:tr>
+      <w:tr>
+        <w:tc>
+          <w:tcPr>
+            <w:tcW w:type="dxa" w:w="4896"/>
+          </w:tcPr>
+          <w:p>
+            <w:r>
+              <w:rPr>
+                <w:rFonts w:ascii="Arial" w:hAnsi="Arial"/>
+                <w:sz w:val="16"/>
+              </w:rPr>
+              <w:t>CORS_ALLOWED_ORIGINS</w:t>
+            </w:r>
+          </w:p>
+        </w:tc>
+        <w:tc>
+          <w:tcPr>
+            <w:tcW w:type="dxa" w:w="4896"/>
+          </w:tcPr>
+          <w:p>
+            <w:r>
+              <w:rPr>
+                <w:rFonts w:ascii="Arial" w:hAnsi="Arial"/>
+                <w:sz w:val="16"/>
+              </w:rPr>
+              <w:t>Origenes Pages/local permitidos.</w:t>
+            </w:r>
+          </w:p>
+        </w:tc>
+      </w:tr>
+      <w:tr>
+        <w:tc>
+          <w:tcPr>
+            <w:tcW w:type="dxa" w:w="4896"/>
+          </w:tcPr>
+          <w:p>
+            <w:r>
+              <w:rPr>
+                <w:rFonts w:ascii="Arial" w:hAnsi="Arial"/>
+                <w:sz w:val="16"/>
+              </w:rPr>
+              <w:t>DB_ENGINE</w:t>
+            </w:r>
+          </w:p>
+        </w:tc>
+        <w:tc>
+          <w:tcPr>
+            <w:tcW w:type="dxa" w:w="4896"/>
+          </w:tcPr>
+          <w:p>
+            <w:r>
+              <w:rPr>
+                <w:rFonts w:ascii="Arial" w:hAnsi="Arial"/>
+                <w:sz w:val="16"/>
+              </w:rPr>
+              <w:t>postgres para Supabase.</w:t>
+            </w:r>
+          </w:p>
+        </w:tc>
+      </w:tr>
+      <w:tr>
+        <w:tc>
+          <w:tcPr>
+            <w:tcW w:type="dxa" w:w="4896"/>
+          </w:tcPr>
+          <w:p>
+            <w:r>
+              <w:rPr>
+                <w:rFonts w:ascii="Arial" w:hAnsi="Arial"/>
+                <w:sz w:val="16"/>
+              </w:rPr>
+              <w:t>POSTGRES_DB/USER/PASSWORD/HOST/PORT/SSLMODE</w:t>
+            </w:r>
+          </w:p>
+        </w:tc>
+        <w:tc>
+          <w:tcPr>
+            <w:tcW w:type="dxa" w:w="4896"/>
+          </w:tcPr>
+          <w:p>
+            <w:r>
+              <w:rPr>
+                <w:rFonts w:ascii="Arial" w:hAnsi="Arial"/>
+                <w:sz w:val="16"/>
+              </w:rPr>
+              <w:t>Conexion Supabase separada para evitar errores de URL.</w:t>
+            </w:r>
+          </w:p>
+        </w:tc>
+      </w:tr>
+      <w:tr>
+        <w:tc>
+          <w:tcPr>
+            <w:tcW w:type="dxa" w:w="4896"/>
+          </w:tcPr>
+          <w:p>
+            <w:r>
+              <w:rPr>
+                <w:rFonts w:ascii="Arial" w:hAnsi="Arial"/>
+                <w:sz w:val="16"/>
+              </w:rPr>
+              <w:t>FACE_MATCH_MAX_DISTANCE</w:t>
+            </w:r>
+          </w:p>
+        </w:tc>
+        <w:tc>
+          <w:tcPr>
+            <w:tcW w:type="dxa" w:w="4896"/>
+          </w:tcPr>
+          <w:p>
+            <w:r>
+              <w:rPr>
+                <w:rFonts w:ascii="Arial" w:hAnsi="Arial"/>
+                <w:sz w:val="16"/>
+              </w:rPr>
+              <w:t>Umbral de reconocimiento facial local.</w:t>
+            </w:r>
+          </w:p>
+        </w:tc>
+      </w:tr>
+      <w:tr>
+        <w:tc>
+          <w:tcPr>
+            <w:tcW w:type="dxa" w:w="4896"/>
+          </w:tcPr>
+          <w:p>
+            <w:r>
+              <w:rPr>
+                <w:rFonts w:ascii="Arial" w:hAnsi="Arial"/>
+                <w:sz w:val="16"/>
+              </w:rPr>
+              <w:t>VITE_API_URL</w:t>
+            </w:r>
+          </w:p>
+        </w:tc>
+        <w:tc>
+          <w:tcPr>
+            <w:tcW w:type="dxa" w:w="4896"/>
+          </w:tcPr>
+          <w:p>
+            <w:r>
+              <w:rPr>
+                <w:rFonts w:ascii="Arial" w:hAnsi="Arial"/>
+                <w:sz w:val="16"/>
+              </w:rPr>
+              <w:t>URL del backend para React.</w:t>
+            </w:r>
+          </w:p>
+        </w:tc>
+      </w:tr>
+      <w:tr>
+        <w:tc>
+          <w:tcPr>
+            <w:tcW w:type="dxa" w:w="4896"/>
+          </w:tcPr>
+          <w:p>
+            <w:r>
+              <w:rPr>
+                <w:rFonts w:ascii="Arial" w:hAnsi="Arial"/>
+                <w:sz w:val="16"/>
+              </w:rPr>
+              <w:t>VITE_BASE_PATH</w:t>
+            </w:r>
+          </w:p>
+        </w:tc>
+        <w:tc>
+          <w:tcPr>
+            <w:tcW w:type="dxa" w:w="4896"/>
+          </w:tcPr>
+          <w:p>
+            <w:r>
+              <w:rPr>
+                <w:rFonts w:ascii="Arial" w:hAnsi="Arial"/>
+                <w:sz w:val="16"/>
+              </w:rPr>
+              <w:t>Base path Pages /futsi/.</w:t>
+            </w:r>
+          </w:p>
+        </w:tc>
+      </w:tr>
+    </w:tbl>
+    <w:p/>
+    <w:p>
+      <w:pPr>
+        <w:pStyle w:val="Heading1"/>
+      </w:pPr>
+      <w:r>
+        <w:t>10. Diseno tecnico de importacion historica Sprint 3</w:t>
+      </w:r>
+    </w:p>
+    <w:p>
+      <w:pPr>
+        <w:pStyle w:val="ListBullet"/>
+      </w:pPr>
+      <w:r>
+        <w:t>Crear comando Django `import_historical_excel` o endpoint admin protegido para subir archivos historicos.</w:t>
+      </w:r>
+    </w:p>
+    <w:p>
+      <w:pPr>
+        <w:pStyle w:val="ListBullet"/>
+      </w:pPr>
+      <w:r>
+        <w:t>Leer hojas con parser estructurado, no con manipulacion de strings; aceptar multiples layouts por hoja.</w:t>
+      </w:r>
+    </w:p>
+    <w:p>
+      <w:pPr>
+        <w:pStyle w:val="ListBullet"/>
+      </w:pPr>
+      <w:r>
+        <w:t>Guardar archivo original y metadatos de carga en `historical_import_batches`.</w:t>
+      </w:r>
+    </w:p>
+    <w:p>
+      <w:pPr>
+        <w:pStyle w:val="ListBullet"/>
+      </w:pPr>
+      <w:r>
+        <w:t>Guardar filas crudas normalizadas en staging antes de crear Payment, Expense, Charge o metricas historicas.</w:t>
+      </w:r>
+    </w:p>
+    <w:p>
+      <w:pPr>
+        <w:pStyle w:val="ListBullet"/>
+      </w:pPr>
+      <w:r>
+        <w:t>Generar reporte de errores descargable: fila, hoja, columna, valor, razon y sugerencia.</w:t>
+      </w:r>
+    </w:p>
+    <w:p>
+      <w:pPr>
+        <w:pStyle w:val="ListBullet"/>
+      </w:pPr>
+      <w:r>
+        <w:t>Crear llaves naturales para deduplicar: periodo, sede, folio, clave, concepto, monto, fecha y fuente.</w:t>
+      </w:r>
+    </w:p>
+    <w:p>
+      <w:pPr>
+        <w:pStyle w:val="ListBullet"/>
+      </w:pPr>
+      <w:r>
+        <w:t>Exponer dashboard de conciliacion: total origen vs total importado vs diferencia por hoja/sede/mes.</w:t>
       </w:r>
     </w:p>
     <w:sectPr>
       <w:pgSz w:w="12240" w:h="15840"/>
-      <w:pgMar w:top="1440" w:right="1440" w:bottom="1440" w:left="1440" w:header="720" w:footer="720" w:gutter="0"/>
+      <w:pgMar w:top="1224" w:right="1224" w:bottom="1224" w:left="1224" w:header="720" w:footer="720" w:gutter="0"/>
       <w:cols w:space="720"/>
       <w:docGrid w:linePitch="360"/>
     </w:sectPr>
@@ -591,11 +2991,11 @@
       <w:outlineLvl w:val="0"/>
     </w:pPr>
     <w:rPr>
-      <w:rFonts w:asciiTheme="majorHAnsi" w:eastAsiaTheme="majorEastAsia" w:hAnsiTheme="majorHAnsi" w:cstheme="majorBidi"/>
+      <w:rFonts w:asciiTheme="majorHAnsi" w:eastAsiaTheme="majorEastAsia" w:hAnsiTheme="majorHAnsi" w:cstheme="majorBidi" w:ascii="Arial" w:hAnsi="Arial"/>
       <w:b/>
       <w:bCs/>
-      <w:color w:val="365F91" w:themeColor="accent1" w:themeShade="BF"/>
-      <w:sz w:val="28"/>
+      <w:color w:val="14532D"/>
+      <w:sz w:val="30"/>
       <w:szCs w:val="28"/>
     </w:rPr>
   </w:style>
@@ -615,11 +3015,11 @@
       <w:outlineLvl w:val="1"/>
     </w:pPr>
     <w:rPr>
-      <w:rFonts w:asciiTheme="majorHAnsi" w:eastAsiaTheme="majorEastAsia" w:hAnsiTheme="majorHAnsi" w:cstheme="majorBidi"/>
+      <w:rFonts w:asciiTheme="majorHAnsi" w:eastAsiaTheme="majorEastAsia" w:hAnsiTheme="majorHAnsi" w:cstheme="majorBidi" w:ascii="Arial" w:hAnsi="Arial"/>
       <w:b/>
       <w:bCs/>
       <w:color w:val="4F81BD" w:themeColor="accent1"/>
-      <w:sz w:val="26"/>
+      <w:sz w:val="24"/>
       <w:szCs w:val="26"/>
     </w:rPr>
   </w:style>

</xml_diff>